<commit_message>
Anchor the Australian baseline to identified instrument versions
Verification found three of the nine APRA instruments had been remade
in 2026 without the register saying so: APS 113 (released 4 Jun 2026,
commenced 30 Jun 2026), CPS 320 (determined 29 Apr 2026, commenced
1 Jul 2026) and CPS 230 (determined 23 Apr 2026, commences 1 Jul 2026).
Commencement dates added throughout; SPS 515 marked unverified rather
than asserted; CPS 320's undownloadable in-force text disclosed.

Co-Authored-By: Claude Opus 5 <noreply@anthropic.com>
Claude-Session: https://claude.ai/code/session_01U9tVmgcRH2aPufRoj4ddoe
</commit_message>
<xml_diff>
--- a/CPS_XXXX_Model_Risk_Management.docx
+++ b/CPS_XXXX_Model_Risk_Management.docx
@@ -11533,7 +11533,7 @@
                 <w:rFonts w:ascii="Arial" w:hAnsi="Arial"/>
                 <w:sz w:val="14"/>
               </w:rPr>
-              <w:t>In force</w:t>
+              <w:t>Commenced 1 Jul 2019</w:t>
             </w:r>
           </w:p>
         </w:tc>
@@ -11639,7 +11639,7 @@
                 <w:rFonts w:ascii="Arial" w:hAnsi="Arial"/>
                 <w:sz w:val="14"/>
               </w:rPr>
-              <w:t>In force</w:t>
+              <w:t>Commenced 1 Jan 2023</w:t>
             </w:r>
           </w:p>
         </w:tc>
@@ -11853,7 +11853,7 @@
                 <w:rFonts w:ascii="Arial" w:hAnsi="Arial"/>
                 <w:sz w:val="14"/>
               </w:rPr>
-              <w:t>Eff. 1 Jul 2019</w:t>
+              <w:t>Commenced 1 Jul 2019</w:t>
             </w:r>
           </w:p>
         </w:tc>
@@ -12067,7 +12067,7 @@
                 <w:rFonts w:ascii="Arial" w:hAnsi="Arial"/>
                 <w:sz w:val="14"/>
               </w:rPr>
-              <w:t>In force</w:t>
+              <w:t>Released 4 Jun 2026; commenced 30 Jun 2026</w:t>
             </w:r>
           </w:p>
         </w:tc>
@@ -12175,7 +12175,7 @@
                 <w:rFonts w:ascii="Arial" w:hAnsi="Arial"/>
                 <w:sz w:val="14"/>
               </w:rPr>
-              <w:t>In force</w:t>
+              <w:t>Determined 29 Apr 2026; commenced 1 Jul 2026</w:t>
             </w:r>
           </w:p>
         </w:tc>
@@ -12281,7 +12281,7 @@
                 <w:rFonts w:ascii="Arial" w:hAnsi="Arial"/>
                 <w:sz w:val="14"/>
               </w:rPr>
-              <w:t>In force</w:t>
+              <w:t>Commenced 1 Jan 2023</w:t>
             </w:r>
           </w:p>
         </w:tc>
@@ -12389,7 +12389,7 @@
                 <w:rFonts w:ascii="Arial" w:hAnsi="Arial"/>
                 <w:sz w:val="14"/>
               </w:rPr>
-              <w:t>In force</w:t>
+              <w:t>In force; commencement not separately verified</w:t>
             </w:r>
           </w:p>
         </w:tc>

</xml_diff>

<commit_message>
Resolve final source-verification findings
The seven-authority verification workflow completed. Two findings bore
on the package:

- the crosswalk asserted the BCBS does not address aggregate model risk.
  Adversarial review suggested Basel prudent valuation guidance may
  require a model risk valuation adjustment and its disclosure. The BIS
  Basel Framework chapters render client-side and could not be retrieved,
  so neither the negative nor the positive is asserted: the cell now
  records the lead and its unverified status, with ledger entry ST-17
  marking it for resolution before consultation.
- the PRA crosswalk cell still attributed aggregate model risk to
  Principle 5; corrected to Principle 2.1 in line with RT-36.

Co-Authored-By: Claude Opus 5 <noreply@anthropic.com>
Claude-Session: https://claude.ai/code/session_01U9tVmgcRH2aPufRoj4ddoe
</commit_message>
<xml_diff>
--- a/CPS_XXXX_Model_Risk_Management.docx
+++ b/CPS_XXXX_Model_Risk_Management.docx
@@ -8657,7 +8657,7 @@
                 <w:rFonts w:ascii="Arial" w:hAnsi="Arial"/>
                 <w:sz w:val="14"/>
               </w:rPr>
-              <w:t>Principle 5 model risk mitigants, and aggregate model risk reporting.</w:t>
+              <w:t>Principle 2.1 board responsibilities, covering understanding and reporting of model risk in aggregate.</w:t>
             </w:r>
           </w:p>
         </w:tc>
@@ -8729,7 +8729,7 @@
                 <w:rFonts w:ascii="Arial" w:hAnsi="Arial"/>
                 <w:sz w:val="14"/>
               </w:rPr>
-              <w:t>Not addressed.</w:t>
+              <w:t>Prudent valuation guidance (CAP50) and the Pillar 3 prudent valuation template may bear on aggregate model risk adjustment and disclosure; not confirmed from primary text at the as-of date.</w:t>
             </w:r>
           </w:p>
         </w:tc>

</xml_diff>